<commit_message>
Update diagrams and documents
</commit_message>
<xml_diff>
--- a/Thesis Writing Documents/CorbinFerguson_ThesisManuscript.docx
+++ b/Thesis Writing Documents/CorbinFerguson_ThesisManuscript.docx
@@ -2896,13 +2896,7 @@
         <w:rPr>
           <w:rFonts w:ascii="Calibri" w:hAnsi="Calibri" w:cs="Calibri"/>
         </w:rPr>
-        <w:t xml:space="preserve"> </w:t>
-      </w:r>
-      <w:r>
-        <w:rPr>
-          <w:rFonts w:ascii="Calibri" w:hAnsi="Calibri" w:cs="Calibri"/>
-        </w:rPr>
-        <w:t>module</w:t>
+        <w:t xml:space="preserve"> module</w:t>
       </w:r>
       <w:r>
         <w:rPr>
@@ -2914,13 +2908,7 @@
         <w:rPr>
           <w:rFonts w:ascii="Calibri" w:hAnsi="Calibri" w:cs="Calibri"/>
         </w:rPr>
-        <w:t xml:space="preserve"> not requiring a “name”</w:t>
-      </w:r>
-      <w:r>
-        <w:rPr>
-          <w:rFonts w:ascii="Calibri" w:hAnsi="Calibri" w:cs="Calibri"/>
-        </w:rPr>
-        <w:t xml:space="preserve"> attribute</w:t>
+        <w:t xml:space="preserve"> not requiring a “name” attribute</w:t>
       </w:r>
       <w:r>
         <w:rPr>
@@ -5126,10 +5114,7 @@
                                     <w:fldChar w:fldCharType="end"/>
                                   </w:r>
                                   <w:r>
-                                    <w:t xml:space="preserve">: </w:t>
-                                  </w:r>
-                                  <w:r>
-                                    <w:t>TextInput</w:t>
+                                    <w:t>: TextInput</w:t>
                                   </w:r>
                                 </w:p>
                               </w:txbxContent>
@@ -5180,10 +5165,7 @@
                               <w:fldChar w:fldCharType="end"/>
                             </w:r>
                             <w:r>
-                              <w:t xml:space="preserve">: </w:t>
-                            </w:r>
-                            <w:r>
-                              <w:t>TextInput</w:t>
+                              <w:t>: TextInput</w:t>
                             </w:r>
                           </w:p>
                         </w:txbxContent>
@@ -28986,6 +28968,7 @@
   <w:style w:type="character" w:default="1" w:styleId="DefaultParagraphFont">
     <w:name w:val="Default Paragraph Font"/>
     <w:uiPriority w:val="1"/>
+    <w:semiHidden/>
     <w:unhideWhenUsed/>
   </w:style>
   <w:style w:type="table" w:default="1" w:styleId="TableNormal">

</xml_diff>